<commit_message>
New documents were uploaded
</commit_message>
<xml_diff>
--- a/Latest Updates/Inventary II - P&R Hub Assistant Chatbot/General Information on Technical Reporting/General information on Technical Reporting .docx
+++ b/Latest Updates/Inventary II - P&R Hub Assistant Chatbot/General Information on Technical Reporting/General information on Technical Reporting .docx
@@ -1,18 +1,48 @@
 
 <file path=word/document.xml><?xml version="1.0" encoding="utf-8"?>
-<w:document xmlns:r="http://schemas.openxmlformats.org/officeDocument/2006/relationships" xmlns:wp="http://schemas.openxmlformats.org/drawingml/2006/wordprocessingDrawing" xmlns:w="http://schemas.openxmlformats.org/wordprocessingml/2006/main" xmlns:w10="urn:schemas-microsoft-com:office:word" xmlns:w14="http://schemas.microsoft.com/office/word/2010/wordml" xmlns:wps="http://schemas.microsoft.com/office/word/2010/wordprocessingShape" xmlns:wpg="http://schemas.microsoft.com/office/word/2010/wordprocessingGroup" xmlns:mc="http://schemas.openxmlformats.org/markup-compatibility/2006" xmlns:v="urn:schemas-microsoft-com:vml" xmlns:o="urn:schemas-microsoft-com:office:office" xmlns:m="http://schemas.openxmlformats.org/officeDocument/2006/math" mc:Ignorable="w14">
+<w:document xmlns:wp14="http://schemas.microsoft.com/office/word/2010/wordprocessingDrawing" xmlns:r="http://schemas.openxmlformats.org/officeDocument/2006/relationships" xmlns:wp="http://schemas.openxmlformats.org/drawingml/2006/wordprocessingDrawing" xmlns:w="http://schemas.openxmlformats.org/wordprocessingml/2006/main" xmlns:w10="urn:schemas-microsoft-com:office:word" xmlns:w14="http://schemas.microsoft.com/office/word/2010/wordml" xmlns:wps="http://schemas.microsoft.com/office/word/2010/wordprocessingShape" xmlns:wpg="http://schemas.microsoft.com/office/word/2010/wordprocessingGroup" xmlns:mc="http://schemas.openxmlformats.org/markup-compatibility/2006" xmlns:v="urn:schemas-microsoft-com:vml" xmlns:o="urn:schemas-microsoft-com:office:office" xmlns:m="http://schemas.openxmlformats.org/officeDocument/2006/math" mc:Ignorable="w14 wp14">
   <w:body>
-    <w:p>
+    <w:p xmlns:wp14="http://schemas.microsoft.com/office/word/2010/wordml" wp14:textId="77777777">
       <w:pPr>
         <w:pStyle w:val="Default"/>
         <w:suppressAutoHyphens w:val="1"/>
         <w:spacing w:before="0" w:line="240" w:lineRule="auto"/>
-        <w:rPr>
-          <w:rFonts w:ascii="Helvetica" w:cs="Helvetica" w:hAnsi="Helvetica" w:eastAsia="Helvetica"/>
+        <w:jc w:val="center"/>
+        <w:rPr>
+          <w:rFonts w:ascii="Helvetica" w:hAnsi="Helvetica" w:eastAsia="Helvetica" w:cs="Helvetica"/>
+          <w:b w:val="1"/>
+          <w:bCs w:val="1"/>
+          <w:outline w:val="0"/>
+          <w:color w:val="000000" w:themeColor="text1" w:themeTint="FF" w:themeShade="FF"/>
+          <w:sz w:val="28"/>
+          <w:szCs w:val="28"/>
+        </w:rPr>
+      </w:pPr>
+      <w:r>
+        <w:rPr>
+          <w:rFonts w:ascii="Helvetica" w:hAnsi="Helvetica"/>
+          <w:b w:val="1"/>
+          <w:bCs w:val="1"/>
+          <w:outline w:val="0"/>
+          <w:color w:val="000000" w:themeColor="text1" w:themeTint="FF" w:themeShade="FF"/>
+          <w:sz w:val="28"/>
+          <w:szCs w:val="28"/>
+          <w:lang w:val="en-US"/>
+        </w:rPr>
+        <w:t>General information on Technical Reporting</w:t>
+      </w:r>
+    </w:p>
+    <w:p xmlns:wp14="http://schemas.microsoft.com/office/word/2010/wordml" wp14:textId="77777777">
+      <w:pPr>
+        <w:pStyle w:val="Default"/>
+        <w:suppressAutoHyphens w:val="1"/>
+        <w:spacing w:before="0" w:line="240" w:lineRule="auto"/>
+        <w:rPr>
+          <w:rFonts w:ascii="Helvetica" w:hAnsi="Helvetica" w:eastAsia="Helvetica" w:cs="Helvetica"/>
           <w:outline w:val="0"/>
           <w:color w:val="065f4a"/>
-          <w:sz w:val="45"/>
-          <w:szCs w:val="45"/>
+          <w:sz w:val="24"/>
+          <w:szCs w:val="24"/>
           <w14:textFill>
             <w14:solidFill>
               <w14:srgbClr w14:val="065F4A"/>
@@ -20,59 +50,23 @@
           </w14:textFill>
         </w:rPr>
       </w:pPr>
-      <w:r>
-        <w:rPr>
-          <w:rFonts w:ascii="Helvetica" w:hAnsi="Helvetica"/>
-          <w:outline w:val="0"/>
-          <w:color w:val="065f4a"/>
-          <w:sz w:val="43"/>
-          <w:szCs w:val="43"/>
-          <w:rtl w:val="0"/>
-          <w:lang w:val="en-US"/>
-          <w14:textFill>
-            <w14:solidFill>
-              <w14:srgbClr w14:val="065F4A"/>
-            </w14:solidFill>
-          </w14:textFill>
-        </w:rPr>
-        <w:t>General information on Technical Reporting</w:t>
-      </w:r>
     </w:p>
-    <w:p>
-      <w:pPr>
-        <w:pStyle w:val="Default"/>
-        <w:suppressAutoHyphens w:val="1"/>
-        <w:spacing w:before="0" w:line="240" w:lineRule="auto"/>
-        <w:rPr>
-          <w:rFonts w:ascii="Helvetica" w:cs="Helvetica" w:hAnsi="Helvetica" w:eastAsia="Helvetica"/>
-          <w:outline w:val="0"/>
-          <w:color w:val="065f4a"/>
-          <w:sz w:val="43"/>
-          <w:szCs w:val="43"/>
-          <w14:textFill>
-            <w14:solidFill>
-              <w14:srgbClr w14:val="065F4A"/>
-            </w14:solidFill>
-          </w14:textFill>
-        </w:rPr>
-      </w:pPr>
-    </w:p>
-    <w:p>
+    <w:p xmlns:wp14="http://schemas.microsoft.com/office/word/2010/wordml" wp14:textId="77777777">
       <w:pPr>
         <w:pStyle w:val="Default"/>
         <w:suppressAutoHyphens w:val="1"/>
         <w:spacing w:before="0" w:line="240" w:lineRule="auto"/>
         <w:jc w:val="left"/>
         <w:rPr>
-          <w:rFonts w:ascii="Arial" w:cs="Arial" w:hAnsi="Arial" w:eastAsia="Arial"/>
+          <w:rFonts w:ascii="Arial" w:hAnsi="Arial" w:eastAsia="Arial" w:cs="Arial"/>
           <w:b w:val="1"/>
           <w:bCs w:val="1"/>
           <w:i w:val="1"/>
           <w:iCs w:val="1"/>
           <w:outline w:val="0"/>
           <w:color w:val="212121"/>
-          <w:sz w:val="29"/>
-          <w:szCs w:val="29"/>
+          <w:sz w:val="24"/>
+          <w:szCs w:val="24"/>
           <w14:textFill>
             <w14:solidFill>
               <w14:srgbClr w14:val="212121"/>
@@ -81,7 +75,7 @@
         </w:rPr>
       </w:pPr>
     </w:p>
-    <w:p>
+    <w:p xmlns:wp14="http://schemas.microsoft.com/office/word/2010/wordml" wp14:textId="77777777">
       <w:pPr>
         <w:pStyle w:val="Default"/>
         <w:numPr>
@@ -97,6 +91,55 @@
           <w:bCs w:val="1"/>
           <w:i w:val="1"/>
           <w:iCs w:val="1"/>
+          <w:outline w:val="0"/>
+          <w:color w:val="212121"/>
+          <w:sz w:val="24"/>
+          <w:szCs w:val="24"/>
+          <w:lang w:val="en-US"/>
+          <w14:textFill>
+            <w14:solidFill>
+              <w14:srgbClr w14:val="212121"/>
+            </w14:solidFill>
+          </w14:textFill>
+        </w:rPr>
+      </w:pPr>
+      <w:r>
+        <w:rPr>
+          <w:rFonts w:ascii="Arial" w:hAnsi="Arial"/>
+          <w:b w:val="1"/>
+          <w:bCs w:val="1"/>
+          <w:i w:val="1"/>
+          <w:iCs w:val="1"/>
+          <w:outline w:val="0"/>
+          <w:color w:val="212121"/>
+          <w:sz w:val="24"/>
+          <w:szCs w:val="24"/>
+          <w:lang w:val="en-US"/>
+          <w14:textFill>
+            <w14:solidFill>
+              <w14:srgbClr w14:val="212121"/>
+            </w14:solidFill>
+          </w14:textFill>
+        </w:rPr>
+        <w:t>Where can I find the key dates for Technical Reporting for 2025?</w:t>
+      </w:r>
+    </w:p>
+    <w:p xmlns:wp14="http://schemas.microsoft.com/office/word/2010/wordml" wp14:textId="77777777">
+      <w:pPr>
+        <w:pStyle w:val="Default"/>
+        <w:suppressAutoHyphens w:val="1"/>
+        <w:spacing w:before="0" w:line="240" w:lineRule="auto"/>
+        <w:rPr>
+          <w:rFonts w:ascii="Helvetica" w:hAnsi="Helvetica"/>
+          <w:color w:val="212121"/>
+          <w:sz w:val="24"/>
+          <w:szCs w:val="24"/>
+          <w:rtl w:val="0"/>
+        </w:rPr>
+      </w:pPr>
+      <w:r>
+        <w:rPr>
+          <w:rFonts w:ascii="Helvetica" w:hAnsi="Helvetica"/>
           <w:outline w:val="0"/>
           <w:color w:val="212121"/>
           <w:sz w:val="29"/>
@@ -108,19 +151,30 @@
             </w14:solidFill>
           </w14:textFill>
         </w:rPr>
-      </w:pPr>
+        <w:t>An overall Technical Reporting timeline can be found on</w:t>
+      </w:r>
       <w:r>
         <w:rPr>
-          <w:rFonts w:ascii="Arial" w:hAnsi="Arial"/>
-          <w:b w:val="1"/>
-          <w:bCs w:val="1"/>
-          <w:i w:val="1"/>
-          <w:iCs w:val="1"/>
+          <w:rFonts w:ascii="Helvetica" w:hAnsi="Helvetica"/>
           <w:outline w:val="0"/>
           <w:color w:val="212121"/>
           <w:sz w:val="29"/>
           <w:szCs w:val="29"/>
-          <w:rtl w:val="0"/>
+          <w14:textFill>
+            <w14:solidFill>
+              <w14:srgbClr w14:val="212121"/>
+            </w14:solidFill>
+          </w14:textFill>
+        </w:rPr>
+        <w:t> </w:t>
+      </w:r>
+      <w:r>
+        <w:rPr>
+          <w:rFonts w:ascii="Helvetica" w:hAnsi="Helvetica"/>
+          <w:outline w:val="0"/>
+          <w:color w:val="212121"/>
+          <w:sz w:val="29"/>
+          <w:szCs w:val="29"/>
           <w:lang w:val="en-US"/>
           <w14:textFill>
             <w14:solidFill>
@@ -128,15 +182,25 @@
             </w14:solidFill>
           </w14:textFill>
         </w:rPr>
-        <w:t>Where can I find the key dates for Technical Reporting for 2025?</w:t>
+        <w:t>this</w:t>
       </w:r>
-    </w:p>
-    <w:p>
-      <w:pPr>
-        <w:pStyle w:val="Default"/>
-        <w:suppressAutoHyphens w:val="1"/>
-        <w:spacing w:before="0" w:line="240" w:lineRule="auto"/>
-      </w:pPr>
+      <w:r>
+        <w:rPr>
+          <w:rFonts w:ascii="Arial" w:hAnsi="Arial"/>
+          <w:b w:val="1"/>
+          <w:bCs w:val="1"/>
+          <w:outline w:val="0"/>
+          <w:color w:val="212121"/>
+          <w:sz w:val="29"/>
+          <w:szCs w:val="29"/>
+          <w14:textFill>
+            <w14:solidFill>
+              <w14:srgbClr w14:val="212121"/>
+            </w14:solidFill>
+          </w14:textFill>
+        </w:rPr>
+        <w:t> </w:t>
+      </w:r>
       <w:r>
         <w:rPr>
           <w:rFonts w:ascii="Helvetica" w:hAnsi="Helvetica"/>
@@ -144,7 +208,6 @@
           <w:color w:val="212121"/>
           <w:sz w:val="29"/>
           <w:szCs w:val="29"/>
-          <w:rtl w:val="0"/>
           <w:lang w:val="en-US"/>
           <w14:textFill>
             <w14:solidFill>
@@ -152,16 +215,17 @@
             </w14:solidFill>
           </w14:textFill>
         </w:rPr>
-        <w:t>An overall Technical Reporting timeline can be found on</w:t>
+        <w:t>page of the P&amp;R Hub.</w:t>
       </w:r>
       <w:r>
         <w:rPr>
-          <w:rFonts w:ascii="Helvetica" w:hAnsi="Helvetica" w:hint="default"/>
+          <w:rFonts w:ascii="Arial" w:hAnsi="Arial"/>
+          <w:b w:val="1"/>
+          <w:bCs w:val="1"/>
           <w:outline w:val="0"/>
           <w:color w:val="212121"/>
           <w:sz w:val="29"/>
           <w:szCs w:val="29"/>
-          <w:rtl w:val="0"/>
           <w14:textFill>
             <w14:solidFill>
               <w14:srgbClr w14:val="212121"/>
@@ -177,7 +241,6 @@
           <w:color w:val="212121"/>
           <w:sz w:val="29"/>
           <w:szCs w:val="29"/>
-          <w:rtl w:val="0"/>
           <w:lang w:val="en-US"/>
           <w14:textFill>
             <w14:solidFill>
@@ -185,99 +248,11 @@
             </w14:solidFill>
           </w14:textFill>
         </w:rPr>
-        <w:t>this</w:t>
-      </w:r>
-      <w:r>
-        <w:rPr>
-          <w:rFonts w:ascii="Arial" w:hAnsi="Arial" w:hint="default"/>
-          <w:b w:val="1"/>
-          <w:bCs w:val="1"/>
-          <w:outline w:val="0"/>
-          <w:color w:val="212121"/>
-          <w:sz w:val="29"/>
-          <w:szCs w:val="29"/>
-          <w:rtl w:val="0"/>
-          <w14:textFill>
-            <w14:solidFill>
-              <w14:srgbClr w14:val="212121"/>
-            </w14:solidFill>
-          </w14:textFill>
-        </w:rPr>
-        <w:t> </w:t>
-      </w:r>
-      <w:r>
-        <w:rPr>
-          <w:rFonts w:ascii="Helvetica" w:hAnsi="Helvetica"/>
-          <w:outline w:val="0"/>
-          <w:color w:val="212121"/>
-          <w:sz w:val="29"/>
-          <w:szCs w:val="29"/>
-          <w:rtl w:val="0"/>
-          <w:lang w:val="en-US"/>
-          <w14:textFill>
-            <w14:solidFill>
-              <w14:srgbClr w14:val="212121"/>
-            </w14:solidFill>
-          </w14:textFill>
-        </w:rPr>
-        <w:t>page of the P&amp;R Hub.</w:t>
-      </w:r>
-      <w:r>
-        <w:rPr>
-          <w:rFonts w:ascii="Arial" w:hAnsi="Arial" w:hint="default"/>
-          <w:b w:val="1"/>
-          <w:bCs w:val="1"/>
-          <w:outline w:val="0"/>
-          <w:color w:val="212121"/>
-          <w:sz w:val="29"/>
-          <w:szCs w:val="29"/>
-          <w:rtl w:val="0"/>
-          <w14:textFill>
-            <w14:solidFill>
-              <w14:srgbClr w14:val="212121"/>
-            </w14:solidFill>
-          </w14:textFill>
-        </w:rPr>
-        <w:t> </w:t>
-      </w:r>
-      <w:r>
-        <w:rPr>
-          <w:rFonts w:ascii="Helvetica" w:hAnsi="Helvetica"/>
-          <w:outline w:val="0"/>
-          <w:color w:val="212121"/>
-          <w:sz w:val="29"/>
-          <w:szCs w:val="29"/>
-          <w:rtl w:val="0"/>
-          <w:lang w:val="en-US"/>
-          <w14:textFill>
-            <w14:solidFill>
-              <w14:srgbClr w14:val="212121"/>
-            </w14:solidFill>
-          </w14:textFill>
-        </w:rPr>
         <w:t>Upcoming key reporting dates and deadlines are also presented on this page. Any updates or changes to the reporting timeline will be communicated via</w:t>
       </w:r>
       <w:r>
         <w:rPr>
-          <w:rFonts w:ascii="Helvetica" w:hAnsi="Helvetica" w:hint="default"/>
-          <w:outline w:val="0"/>
-          <w:color w:val="13bc95"/>
-          <w:sz w:val="29"/>
-          <w:szCs w:val="29"/>
-          <w:u w:val="single"/>
-          <w:rtl w:val="0"/>
-          <w14:textFill>
-            <w14:solidFill>
-              <w14:srgbClr w14:val="13BC95"/>
-            </w14:solidFill>
-          </w14:textFill>
-        </w:rPr>
-        <w:t> </w:t>
-      </w:r>
-      <w:r>
-        <w:rPr>
-          <w:rStyle w:val="Hyperlink.0"/>
-          <w:rFonts w:ascii="Helvetica" w:cs="Helvetica" w:hAnsi="Helvetica" w:eastAsia="Helvetica"/>
+          <w:rFonts w:ascii="Helvetica" w:hAnsi="Helvetica"/>
           <w:outline w:val="0"/>
           <w:color w:val="13bc95"/>
           <w:sz w:val="29"/>
@@ -289,12 +264,12 @@
             </w14:solidFill>
           </w14:textFill>
         </w:rPr>
-        <w:fldChar w:fldCharType="begin" w:fldLock="0"/>
+        <w:t> </w:t>
       </w:r>
       <w:r>
         <w:rPr>
           <w:rStyle w:val="Hyperlink.0"/>
-          <w:rFonts w:ascii="Helvetica" w:cs="Helvetica" w:hAnsi="Helvetica" w:eastAsia="Helvetica"/>
+          <w:rFonts w:ascii="Helvetica" w:hAnsi="Helvetica" w:eastAsia="Helvetica" w:cs="Helvetica"/>
           <w:outline w:val="0"/>
           <w:color w:val="13bc95"/>
           <w:sz w:val="29"/>
@@ -306,12 +281,12 @@
             </w14:solidFill>
           </w14:textFill>
         </w:rPr>
-        <w:instrText xml:space="preserve"> HYPERLINK "mailto:performanceandresults@cgiar.org"</w:instrText>
+        <w:fldChar w:fldCharType="begin" w:fldLock="0"/>
       </w:r>
       <w:r>
         <w:rPr>
           <w:rStyle w:val="Hyperlink.0"/>
-          <w:rFonts w:ascii="Helvetica" w:cs="Helvetica" w:hAnsi="Helvetica" w:eastAsia="Helvetica"/>
+          <w:rFonts w:ascii="Helvetica" w:hAnsi="Helvetica" w:eastAsia="Helvetica" w:cs="Helvetica"/>
           <w:outline w:val="0"/>
           <w:color w:val="13bc95"/>
           <w:sz w:val="29"/>
@@ -323,6 +298,23 @@
             </w14:solidFill>
           </w14:textFill>
         </w:rPr>
+        <w:instrText xml:space="preserve"> HYPERLINK "mailto:performanceandresults@cgiar.org"</w:instrText>
+      </w:r>
+      <w:r>
+        <w:rPr>
+          <w:rStyle w:val="Hyperlink.0"/>
+          <w:rFonts w:ascii="Helvetica" w:hAnsi="Helvetica" w:eastAsia="Helvetica" w:cs="Helvetica"/>
+          <w:outline w:val="0"/>
+          <w:color w:val="13bc95"/>
+          <w:sz w:val="29"/>
+          <w:szCs w:val="29"/>
+          <w:u w:val="single"/>
+          <w14:textFill>
+            <w14:solidFill>
+              <w14:srgbClr w14:val="13BC95"/>
+            </w14:solidFill>
+          </w14:textFill>
+        </w:rPr>
         <w:fldChar w:fldCharType="separate" w:fldLock="0"/>
       </w:r>
       <w:r>
@@ -334,7 +326,6 @@
           <w:sz w:val="29"/>
           <w:szCs w:val="29"/>
           <w:u w:val="single"/>
-          <w:rtl w:val="0"/>
           <w:lang w:val="pt-PT"/>
           <w14:textFill>
             <w14:solidFill>
@@ -346,7 +337,7 @@
       </w:r>
       <w:r>
         <w:rPr>
-          <w:rFonts w:ascii="Helvetica" w:cs="Helvetica" w:hAnsi="Helvetica" w:eastAsia="Helvetica"/>
+          <w:rFonts w:ascii="Helvetica" w:hAnsi="Helvetica" w:eastAsia="Helvetica" w:cs="Helvetica"/>
           <w:outline w:val="0"/>
           <w:color w:val="212121"/>
           <w:sz w:val="29"/>
@@ -366,7 +357,6 @@
           <w:color w:val="212121"/>
           <w:sz w:val="29"/>
           <w:szCs w:val="29"/>
-          <w:rtl w:val="0"/>
           <w14:textFill>
             <w14:solidFill>
               <w14:srgbClr w14:val="212121"/>
@@ -378,7 +368,7 @@
       <w:r>
         <w:rPr>
           <w:rStyle w:val="None"/>
-          <w:rFonts w:ascii="Helvetica" w:cs="Helvetica" w:hAnsi="Helvetica" w:eastAsia="Helvetica"/>
+          <w:rFonts w:ascii="Helvetica" w:hAnsi="Helvetica" w:eastAsia="Helvetica" w:cs="Helvetica"/>
           <w:outline w:val="0"/>
           <w:color w:val="212121"/>
           <w:sz w:val="29"/>
@@ -391,28 +381,169 @@
         </w:rPr>
       </w:r>
     </w:p>
+    <w:p>
+      <w:pPr>
+        <w:pStyle w:val="ListParagraph"/>
+        <w:numPr>
+          <w:ilvl w:val="0"/>
+          <w:numId w:val="3"/>
+        </w:numPr>
+        <w:spacing w:before="220" w:beforeAutospacing="off" w:after="220" w:afterAutospacing="off"/>
+        <w:rPr>
+          <w:rFonts w:ascii="Lato" w:hAnsi="Lato" w:eastAsia="Lato" w:cs="Lato"/>
+          <w:b w:val="1"/>
+          <w:bCs w:val="1"/>
+          <w:i w:val="1"/>
+          <w:iCs w:val="1"/>
+          <w:caps w:val="0"/>
+          <w:smallCaps w:val="0"/>
+          <w:strike w:val="0"/>
+          <w:dstrike w:val="0"/>
+          <w:noProof w:val="0"/>
+          <w:color w:val="000000" w:themeColor="text1" w:themeTint="FF" w:themeShade="FF"/>
+          <w:sz w:val="24"/>
+          <w:szCs w:val="24"/>
+          <w:u w:val="none"/>
+          <w:lang w:val="en-US"/>
+        </w:rPr>
+      </w:pPr>
+      <w:r>
+        <w:rPr>
+          <w:rFonts w:ascii="Lato" w:hAnsi="Lato" w:eastAsia="Lato" w:cs="Lato"/>
+          <w:b w:val="1"/>
+          <w:bCs w:val="1"/>
+          <w:i w:val="1"/>
+          <w:iCs w:val="1"/>
+          <w:caps w:val="0"/>
+          <w:smallCaps w:val="0"/>
+          <w:strike w:val="0"/>
+          <w:dstrike w:val="0"/>
+          <w:noProof w:val="0"/>
+          <w:color w:val="000000" w:themeColor="text1" w:themeTint="FF" w:themeShade="FF"/>
+          <w:sz w:val="24"/>
+          <w:szCs w:val="24"/>
+          <w:u w:val="none"/>
+          <w:lang w:val="en-US"/>
+        </w:rPr>
+        <w:t>Is there a CGIAR Style Guide to follow for preparing the narrative components of the Technical Reporting?</w:t>
+      </w:r>
+    </w:p>
+    <w:p>
+      <w:pPr>
+        <w:spacing w:before="0" w:beforeAutospacing="off" w:after="0" w:afterAutospacing="off"/>
+      </w:pPr>
+      <w:r>
+        <w:rPr>
+          <w:rFonts w:ascii="Lato" w:hAnsi="Lato" w:eastAsia="Lato" w:cs="Lato"/>
+          <w:b w:val="0"/>
+          <w:bCs w:val="0"/>
+          <w:i w:val="0"/>
+          <w:iCs w:val="0"/>
+          <w:caps w:val="0"/>
+          <w:smallCaps w:val="0"/>
+          <w:strike w:val="0"/>
+          <w:dstrike w:val="0"/>
+          <w:noProof w:val="0"/>
+          <w:color w:val="000000" w:themeColor="text1" w:themeTint="FF" w:themeShade="FF"/>
+          <w:sz w:val="22"/>
+          <w:szCs w:val="22"/>
+          <w:u w:val="none"/>
+          <w:lang w:val="en-US"/>
+        </w:rPr>
+        <w:t xml:space="preserve">Yes, the </w:t>
+      </w:r>
+      <w:hyperlink r:id="R341f0cc3903c4393">
+        <w:r>
+          <w:rPr>
+            <w:rStyle w:val="Hyperlink"/>
+            <w:rFonts w:ascii="Lato" w:hAnsi="Lato" w:eastAsia="Lato" w:cs="Lato"/>
+            <w:b w:val="0"/>
+            <w:bCs w:val="0"/>
+            <w:i w:val="0"/>
+            <w:iCs w:val="0"/>
+            <w:caps w:val="0"/>
+            <w:smallCaps w:val="0"/>
+            <w:strike w:val="0"/>
+            <w:dstrike w:val="0"/>
+            <w:noProof w:val="0"/>
+            <w:color w:val="13BC95"/>
+            <w:sz w:val="22"/>
+            <w:szCs w:val="22"/>
+            <w:u w:val="none"/>
+            <w:lang w:val="en-US"/>
+          </w:rPr>
+          <w:t>CGIAR Style Guide</w:t>
+        </w:r>
+      </w:hyperlink>
+      <w:r>
+        <w:rPr>
+          <w:rFonts w:ascii="Lato" w:hAnsi="Lato" w:eastAsia="Lato" w:cs="Lato"/>
+          <w:b w:val="0"/>
+          <w:bCs w:val="0"/>
+          <w:i w:val="0"/>
+          <w:iCs w:val="0"/>
+          <w:caps w:val="0"/>
+          <w:smallCaps w:val="0"/>
+          <w:strike w:val="0"/>
+          <w:dstrike w:val="0"/>
+          <w:noProof w:val="0"/>
+          <w:color w:val="000000" w:themeColor="text1" w:themeTint="FF" w:themeShade="FF"/>
+          <w:sz w:val="22"/>
+          <w:szCs w:val="22"/>
+          <w:u w:val="none"/>
+          <w:lang w:val="en-US"/>
+        </w:rPr>
+        <w:t xml:space="preserve"> </w:t>
+      </w:r>
+      <w:r>
+        <w:rPr>
+          <w:rFonts w:ascii="Lato" w:hAnsi="Lato" w:eastAsia="Lato" w:cs="Lato"/>
+          <w:b w:val="0"/>
+          <w:bCs w:val="0"/>
+          <w:i w:val="0"/>
+          <w:iCs w:val="0"/>
+          <w:caps w:val="0"/>
+          <w:smallCaps w:val="0"/>
+          <w:strike w:val="0"/>
+          <w:dstrike w:val="0"/>
+          <w:noProof w:val="0"/>
+          <w:color w:val="000000" w:themeColor="text1" w:themeTint="FF" w:themeShade="FF"/>
+          <w:sz w:val="22"/>
+          <w:szCs w:val="22"/>
+          <w:u w:val="none"/>
+          <w:lang w:val="en-US"/>
+        </w:rPr>
+        <w:t>can be used as a reference.</w:t>
+      </w:r>
+    </w:p>
+    <w:p>
+      <w:pPr>
+        <w:pStyle w:val="Default"/>
+      </w:pPr>
+    </w:p>
     <w:sectPr>
       <w:headerReference w:type="default" r:id="rId4"/>
       <w:footerReference w:type="default" r:id="rId5"/>
       <w:pgSz w:w="11906" w:h="16838" w:orient="portrait"/>
       <w:pgMar w:top="1134" w:right="1134" w:bottom="1134" w:left="1134" w:header="709" w:footer="850"/>
       <w:bidi w:val="0"/>
+      <w:cols w:num="1"/>
     </w:sectPr>
   </w:body>
 </w:document>
 </file>
 
 <file path=word/footer1.xml><?xml version="1.0" encoding="utf-8"?>
-<w:ftr xmlns:r="http://schemas.openxmlformats.org/officeDocument/2006/relationships" xmlns:wp="http://schemas.openxmlformats.org/drawingml/2006/wordprocessingDrawing" xmlns:w="http://schemas.openxmlformats.org/wordprocessingml/2006/main" xmlns:w10="urn:schemas-microsoft-com:office:word" xmlns:w14="http://schemas.microsoft.com/office/word/2010/wordml" xmlns:wps="http://schemas.microsoft.com/office/word/2010/wordprocessingShape" xmlns:wpg="http://schemas.microsoft.com/office/word/2010/wordprocessingGroup" xmlns:mc="http://schemas.openxmlformats.org/markup-compatibility/2006" xmlns:v="urn:schemas-microsoft-com:vml" xmlns:o="urn:schemas-microsoft-com:office:office" xmlns:m="http://schemas.openxmlformats.org/officeDocument/2006/math" mc:Ignorable="w14">
-  <w:p>
+<w:ftr xmlns:wp14="http://schemas.microsoft.com/office/word/2010/wordprocessingDrawing" xmlns:r="http://schemas.openxmlformats.org/officeDocument/2006/relationships" xmlns:wp="http://schemas.openxmlformats.org/drawingml/2006/wordprocessingDrawing" xmlns:w="http://schemas.openxmlformats.org/wordprocessingml/2006/main" xmlns:w10="urn:schemas-microsoft-com:office:word" xmlns:w14="http://schemas.microsoft.com/office/word/2010/wordml" xmlns:wps="http://schemas.microsoft.com/office/word/2010/wordprocessingShape" xmlns:wpg="http://schemas.microsoft.com/office/word/2010/wordprocessingGroup" xmlns:mc="http://schemas.openxmlformats.org/markup-compatibility/2006" xmlns:v="urn:schemas-microsoft-com:vml" xmlns:o="urn:schemas-microsoft-com:office:office" xmlns:m="http://schemas.openxmlformats.org/officeDocument/2006/math" mc:Ignorable="w14 wp14">
+  <w:p xmlns:wp14="http://schemas.microsoft.com/office/word/2010/wordml" wp14:textId="77777777">
     <w:r/>
   </w:p>
 </w:ftr>
 </file>
 
 <file path=word/header1.xml><?xml version="1.0" encoding="utf-8"?>
-<w:hdr xmlns:r="http://schemas.openxmlformats.org/officeDocument/2006/relationships" xmlns:wp="http://schemas.openxmlformats.org/drawingml/2006/wordprocessingDrawing" xmlns:w="http://schemas.openxmlformats.org/wordprocessingml/2006/main" xmlns:w10="urn:schemas-microsoft-com:office:word" xmlns:w14="http://schemas.microsoft.com/office/word/2010/wordml" xmlns:wps="http://schemas.microsoft.com/office/word/2010/wordprocessingShape" xmlns:wpg="http://schemas.microsoft.com/office/word/2010/wordprocessingGroup" xmlns:mc="http://schemas.openxmlformats.org/markup-compatibility/2006" xmlns:v="urn:schemas-microsoft-com:vml" xmlns:o="urn:schemas-microsoft-com:office:office" xmlns:m="http://schemas.openxmlformats.org/officeDocument/2006/math" mc:Ignorable="w14">
-  <w:p>
+<w:hdr xmlns:wp14="http://schemas.microsoft.com/office/word/2010/wordprocessingDrawing" xmlns:r="http://schemas.openxmlformats.org/officeDocument/2006/relationships" xmlns:wp="http://schemas.openxmlformats.org/drawingml/2006/wordprocessingDrawing" xmlns:w="http://schemas.openxmlformats.org/wordprocessingml/2006/main" xmlns:w10="urn:schemas-microsoft-com:office:word" xmlns:w14="http://schemas.microsoft.com/office/word/2010/wordml" xmlns:wps="http://schemas.microsoft.com/office/word/2010/wordprocessingShape" xmlns:wpg="http://schemas.microsoft.com/office/word/2010/wordprocessingGroup" xmlns:mc="http://schemas.openxmlformats.org/markup-compatibility/2006" xmlns:v="urn:schemas-microsoft-com:vml" xmlns:o="urn:schemas-microsoft-com:office:office" xmlns:m="http://schemas.openxmlformats.org/officeDocument/2006/math" mc:Ignorable="w14 wp14">
+  <w:p xmlns:wp14="http://schemas.microsoft.com/office/word/2010/wordml" wp14:textId="77777777">
     <w:r/>
   </w:p>
 </w:hdr>
@@ -420,11 +551,98 @@
 
 <file path=word/numbering.xml><?xml version="1.0" encoding="utf-8"?>
 <w:numbering xmlns:w="http://schemas.openxmlformats.org/wordprocessingml/2006/main" xmlns:wp="http://schemas.openxmlformats.org/drawingml/2006/wordprocessingDrawing" xmlns:w14="http://schemas.microsoft.com/office/word/2010/wordml" xmlns:r="http://schemas.openxmlformats.org/officeDocument/2006/relationships" xmlns:v="urn:schemas-microsoft-com:vml" xmlns:o="urn:schemas-microsoft-com:office:office">
+  <w:abstractNum xmlns:w="http://schemas.openxmlformats.org/wordprocessingml/2006/main" w:abstractNumId="2">
+    <w:nsid w:val="43c55f1f"/>
+    <w:multiLevelType xmlns:w="http://schemas.openxmlformats.org/wordprocessingml/2006/main" w:val="hybridMultilevel"/>
+    <w:lvl xmlns:w="http://schemas.openxmlformats.org/wordprocessingml/2006/main" w:ilvl="0">
+      <w:start w:val="2"/>
+      <w:numFmt w:val="decimal"/>
+      <w:lvlText w:val="%1."/>
+      <w:lvlJc w:val="left"/>
+      <w:pPr>
+        <w:ind w:left="720" w:hanging="360"/>
+      </w:pPr>
+    </w:lvl>
+    <w:lvl xmlns:w="http://schemas.openxmlformats.org/wordprocessingml/2006/main" w:ilvl="1">
+      <w:start w:val="1"/>
+      <w:numFmt w:val="lowerLetter"/>
+      <w:lvlText w:val="%2."/>
+      <w:lvlJc w:val="left"/>
+      <w:pPr>
+        <w:ind w:left="1440" w:hanging="360"/>
+      </w:pPr>
+    </w:lvl>
+    <w:lvl xmlns:w="http://schemas.openxmlformats.org/wordprocessingml/2006/main" w:ilvl="2">
+      <w:start w:val="1"/>
+      <w:numFmt w:val="lowerRoman"/>
+      <w:lvlText w:val="%3."/>
+      <w:lvlJc w:val="right"/>
+      <w:pPr>
+        <w:ind w:left="2160" w:hanging="180"/>
+      </w:pPr>
+    </w:lvl>
+    <w:lvl xmlns:w="http://schemas.openxmlformats.org/wordprocessingml/2006/main" w:ilvl="3">
+      <w:start w:val="1"/>
+      <w:numFmt w:val="decimal"/>
+      <w:lvlText w:val="%4."/>
+      <w:lvlJc w:val="left"/>
+      <w:pPr>
+        <w:ind w:left="2880" w:hanging="360"/>
+      </w:pPr>
+    </w:lvl>
+    <w:lvl xmlns:w="http://schemas.openxmlformats.org/wordprocessingml/2006/main" w:ilvl="4">
+      <w:start w:val="1"/>
+      <w:numFmt w:val="lowerLetter"/>
+      <w:lvlText w:val="%5."/>
+      <w:lvlJc w:val="left"/>
+      <w:pPr>
+        <w:ind w:left="3600" w:hanging="360"/>
+      </w:pPr>
+    </w:lvl>
+    <w:lvl xmlns:w="http://schemas.openxmlformats.org/wordprocessingml/2006/main" w:ilvl="5">
+      <w:start w:val="1"/>
+      <w:numFmt w:val="lowerRoman"/>
+      <w:lvlText w:val="%6."/>
+      <w:lvlJc w:val="right"/>
+      <w:pPr>
+        <w:ind w:left="4320" w:hanging="180"/>
+      </w:pPr>
+    </w:lvl>
+    <w:lvl xmlns:w="http://schemas.openxmlformats.org/wordprocessingml/2006/main" w:ilvl="6">
+      <w:start w:val="1"/>
+      <w:numFmt w:val="decimal"/>
+      <w:lvlText w:val="%7."/>
+      <w:lvlJc w:val="left"/>
+      <w:pPr>
+        <w:ind w:left="5040" w:hanging="360"/>
+      </w:pPr>
+    </w:lvl>
+    <w:lvl xmlns:w="http://schemas.openxmlformats.org/wordprocessingml/2006/main" w:ilvl="7">
+      <w:start w:val="1"/>
+      <w:numFmt w:val="lowerLetter"/>
+      <w:lvlText w:val="%8."/>
+      <w:lvlJc w:val="left"/>
+      <w:pPr>
+        <w:ind w:left="5760" w:hanging="360"/>
+      </w:pPr>
+    </w:lvl>
+    <w:lvl xmlns:w="http://schemas.openxmlformats.org/wordprocessingml/2006/main" w:ilvl="8">
+      <w:start w:val="1"/>
+      <w:numFmt w:val="lowerRoman"/>
+      <w:lvlText w:val="%9."/>
+      <w:lvlJc w:val="right"/>
+      <w:pPr>
+        <w:ind w:left="6480" w:hanging="180"/>
+      </w:pPr>
+    </w:lvl>
+  </w:abstractNum>
   <w:abstractNum w:abstractNumId="0">
+    <w:nsid w:val="5462b0e7"/>
     <w:multiLevelType w:val="hybridMultilevel"/>
     <w:numStyleLink w:val="Numbered"/>
   </w:abstractNum>
   <w:abstractNum w:abstractNumId="1">
+    <w:nsid w:val="3d357a7d"/>
     <w:multiLevelType w:val="hybridMultilevel"/>
     <w:styleLink w:val="Numbered"/>
     <w:lvl w:ilvl="0">
@@ -437,7 +655,7 @@
         <w:ind w:left="720" w:hanging="500"/>
       </w:pPr>
       <w:rPr>
-        <w:rFonts w:ascii="Arial" w:cs="Arial" w:hAnsi="Arial" w:eastAsia="Arial"/>
+        <w:rFonts w:ascii="Arial" w:hAnsi="Arial" w:eastAsia="Arial" w:cs="Arial"/>
         <w:b w:val="1"/>
         <w:bCs w:val="1"/>
         <w:i w:val="1"/>
@@ -468,7 +686,7 @@
         <w:ind w:left="940" w:hanging="500"/>
       </w:pPr>
       <w:rPr>
-        <w:rFonts w:ascii="Arial" w:cs="Arial" w:hAnsi="Arial" w:eastAsia="Arial"/>
+        <w:rFonts w:ascii="Arial" w:hAnsi="Arial" w:eastAsia="Arial" w:cs="Arial"/>
         <w:b w:val="1"/>
         <w:bCs w:val="1"/>
         <w:i w:val="1"/>
@@ -499,7 +717,7 @@
         <w:ind w:left="1160" w:hanging="500"/>
       </w:pPr>
       <w:rPr>
-        <w:rFonts w:ascii="Arial" w:cs="Arial" w:hAnsi="Arial" w:eastAsia="Arial"/>
+        <w:rFonts w:ascii="Arial" w:hAnsi="Arial" w:eastAsia="Arial" w:cs="Arial"/>
         <w:b w:val="1"/>
         <w:bCs w:val="1"/>
         <w:i w:val="1"/>
@@ -530,7 +748,7 @@
         <w:ind w:left="1380" w:hanging="500"/>
       </w:pPr>
       <w:rPr>
-        <w:rFonts w:ascii="Arial" w:cs="Arial" w:hAnsi="Arial" w:eastAsia="Arial"/>
+        <w:rFonts w:ascii="Arial" w:hAnsi="Arial" w:eastAsia="Arial" w:cs="Arial"/>
         <w:b w:val="1"/>
         <w:bCs w:val="1"/>
         <w:i w:val="1"/>
@@ -561,7 +779,7 @@
         <w:ind w:left="1600" w:hanging="500"/>
       </w:pPr>
       <w:rPr>
-        <w:rFonts w:ascii="Arial" w:cs="Arial" w:hAnsi="Arial" w:eastAsia="Arial"/>
+        <w:rFonts w:ascii="Arial" w:hAnsi="Arial" w:eastAsia="Arial" w:cs="Arial"/>
         <w:b w:val="1"/>
         <w:bCs w:val="1"/>
         <w:i w:val="1"/>
@@ -592,7 +810,7 @@
         <w:ind w:left="1820" w:hanging="500"/>
       </w:pPr>
       <w:rPr>
-        <w:rFonts w:ascii="Arial" w:cs="Arial" w:hAnsi="Arial" w:eastAsia="Arial"/>
+        <w:rFonts w:ascii="Arial" w:hAnsi="Arial" w:eastAsia="Arial" w:cs="Arial"/>
         <w:b w:val="1"/>
         <w:bCs w:val="1"/>
         <w:i w:val="1"/>
@@ -623,7 +841,7 @@
         <w:ind w:left="2040" w:hanging="500"/>
       </w:pPr>
       <w:rPr>
-        <w:rFonts w:ascii="Arial" w:cs="Arial" w:hAnsi="Arial" w:eastAsia="Arial"/>
+        <w:rFonts w:ascii="Arial" w:hAnsi="Arial" w:eastAsia="Arial" w:cs="Arial"/>
         <w:b w:val="1"/>
         <w:bCs w:val="1"/>
         <w:i w:val="1"/>
@@ -654,7 +872,7 @@
         <w:ind w:left="2260" w:hanging="500"/>
       </w:pPr>
       <w:rPr>
-        <w:rFonts w:ascii="Arial" w:cs="Arial" w:hAnsi="Arial" w:eastAsia="Arial"/>
+        <w:rFonts w:ascii="Arial" w:hAnsi="Arial" w:eastAsia="Arial" w:cs="Arial"/>
         <w:b w:val="1"/>
         <w:bCs w:val="1"/>
         <w:i w:val="1"/>
@@ -685,7 +903,7 @@
         <w:ind w:left="2480" w:hanging="500"/>
       </w:pPr>
       <w:rPr>
-        <w:rFonts w:ascii="Arial" w:cs="Arial" w:hAnsi="Arial" w:eastAsia="Arial"/>
+        <w:rFonts w:ascii="Arial" w:hAnsi="Arial" w:eastAsia="Arial" w:cs="Arial"/>
         <w:b w:val="1"/>
         <w:bCs w:val="1"/>
         <w:i w:val="1"/>
@@ -707,6 +925,9 @@
       </w:rPr>
     </w:lvl>
   </w:abstractNum>
+  <w:num w:numId="3">
+    <w:abstractNumId w:val="2"/>
+  </w:num>
   <w:num w:numId="1">
     <w:abstractNumId w:val="1"/>
   </w:num>
@@ -717,11 +938,11 @@
 </file>
 
 <file path=word/styles.xml><?xml version="1.0" encoding="utf-8"?>
-<w:styles xmlns:w="http://schemas.openxmlformats.org/wordprocessingml/2006/main" xmlns:mc="http://schemas.openxmlformats.org/markup-compatibility/2006" xmlns:w14="http://schemas.microsoft.com/office/word/2010/wordml" mc:Ignorable="w14">
+<w:styles xmlns:wp14="http://schemas.microsoft.com/office/word/2010/wordprocessingDrawing" xmlns:w="http://schemas.openxmlformats.org/wordprocessingml/2006/main" xmlns:mc="http://schemas.openxmlformats.org/markup-compatibility/2006" xmlns:w14="http://schemas.microsoft.com/office/word/2010/wordml" mc:Ignorable="w14 wp14">
   <w:docDefaults>
     <w:rPrDefault>
       <w:rPr>
-        <w:rFonts w:ascii="Times New Roman" w:cs="Times New Roman" w:hAnsi="Times New Roman" w:eastAsia="Arial Unicode MS"/>
+        <w:rFonts w:ascii="Times New Roman" w:hAnsi="Times New Roman" w:eastAsia="Arial Unicode MS" w:cs="Times New Roman"/>
         <w:b w:val="0"/>
         <w:bCs w:val="0"/>
         <w:i w:val="0"/>
@@ -752,7 +973,7 @@
         <w:keepNext w:val="0"/>
         <w:keepLines w:val="0"/>
         <w:pageBreakBefore w:val="0"/>
-        <w:framePr w:anchorLock="0" w:w="0" w:h="0" w:vSpace="0" w:hSpace="0" w:xAlign="left" w:y="0" w:hRule="exact" w:vAnchor="margin"/>
+        <w:framePr w:w="0" w:h="0" w:vSpace="0" w:hSpace="0" w:vAnchor="margin" w:xAlign="left" w:y="0" w:hRule="exact" w:anchorLock="0"/>
         <w:widowControl w:val="1"/>
         <w:numPr>
           <w:ilvl w:val="0"/>
@@ -776,7 +997,7 @@
       </w:pPr>
     </w:pPrDefault>
   </w:docDefaults>
-  <w:style w:type="paragraph" w:default="1" w:styleId="Normal">
+  <w:style w:type="paragraph" w:styleId="Normal" w:default="1">
     <w:name w:val="Normal"/>
     <w:next w:val="Normal"/>
     <w:pPr/>
@@ -786,7 +1007,7 @@
       <w:lang w:val="en-US" w:eastAsia="en-US" w:bidi="ar-SA"/>
     </w:rPr>
   </w:style>
-  <w:style w:type="character" w:default="1" w:styleId="Default Paragraph Font">
+  <w:style w:type="character" w:styleId="Default Paragraph Font" w:default="1">
     <w:name w:val="Default Paragraph Font"/>
     <w:next w:val="Default Paragraph Font"/>
   </w:style>
@@ -796,7 +1017,7 @@
       <w:u w:val="single"/>
     </w:rPr>
   </w:style>
-  <w:style w:type="table" w:default="1" w:styleId="Table Normal">
+  <w:style w:type="table" w:styleId="Table Normal" w:default="1">
     <w:name w:val="Table Normal"/>
     <w:next w:val="Table Normal"/>
     <w:pPr/>
@@ -818,7 +1039,7 @@
     <w:tblStylePr w:type="seCell"/>
     <w:tblStylePr w:type="swCell"/>
   </w:style>
-  <w:style w:type="numbering" w:default="1" w:styleId="No List">
+  <w:style w:type="numbering" w:styleId="No List" w:default="1">
     <w:name w:val="No List"/>
     <w:next w:val="No List"/>
     <w:pPr/>
@@ -840,7 +1061,7 @@
       <w:outlineLvl w:val="9"/>
     </w:pPr>
     <w:rPr>
-      <w:rFonts w:ascii="Helvetica Neue" w:cs="Arial Unicode MS" w:hAnsi="Helvetica Neue" w:eastAsia="Arial Unicode MS"/>
+      <w:rFonts w:ascii="Helvetica Neue" w:hAnsi="Helvetica Neue" w:eastAsia="Arial Unicode MS" w:cs="Arial Unicode MS"/>
       <w:b w:val="0"/>
       <w:bCs w:val="0"/>
       <w:i w:val="0"/>
@@ -895,6 +1116,18 @@
         </w14:solidFill>
       </w14:textFill>
     </w:rPr>
+  </w:style>
+  <w:style w:type="paragraph" w:styleId="ListParagraph">
+    <w:uiPriority w:val="34"/>
+    <w:name w:val="List Paragraph"/>
+    <w:basedOn w:val="Normal"/>
+    <w:qFormat/>
+    <w:rsid w:val="3D25B1C3"/>
+    <w:pPr>
+      <w:spacing/>
+      <w:ind w:left="720"/>
+      <w:contextualSpacing/>
+    </w:pPr>
   </w:style>
 </w:styles>
 </file>
@@ -1118,7 +1351,7 @@
           <a:buFontTx/>
           <a:buNone/>
           <a:tabLst/>
-          <a:defRPr b="0" baseline="0" cap="none" i="0" spc="0" strike="noStrike" sz="1200" u="none" kumimoji="0" normalizeH="0">
+          <a:defRPr kumimoji="0" sz="1200" b="0" i="0" u="none" strike="noStrike" cap="none" spc="0" normalizeH="0" baseline="0">
             <a:ln>
               <a:noFill/>
             </a:ln>
@@ -1148,7 +1381,7 @@
           <a:buFontTx/>
           <a:buNone/>
           <a:tabLst/>
-          <a:defRPr b="0" baseline="0" cap="none" i="0" spc="0" strike="noStrike" sz="1800" u="none" kumimoji="0" normalizeH="0">
+          <a:defRPr kumimoji="0" sz="1800" b="0" i="0" u="none" strike="noStrike" cap="none" spc="0" normalizeH="0" baseline="0">
             <a:ln>
               <a:noFill/>
             </a:ln>
@@ -1174,7 +1407,7 @@
           <a:buFontTx/>
           <a:buNone/>
           <a:tabLst/>
-          <a:defRPr b="0" baseline="0" cap="none" i="0" spc="0" strike="noStrike" sz="1800" u="none" kumimoji="0" normalizeH="0">
+          <a:defRPr kumimoji="0" sz="1800" b="0" i="0" u="none" strike="noStrike" cap="none" spc="0" normalizeH="0" baseline="0">
             <a:ln>
               <a:noFill/>
             </a:ln>
@@ -1200,7 +1433,7 @@
           <a:buFontTx/>
           <a:buNone/>
           <a:tabLst/>
-          <a:defRPr b="0" baseline="0" cap="none" i="0" spc="0" strike="noStrike" sz="1800" u="none" kumimoji="0" normalizeH="0">
+          <a:defRPr kumimoji="0" sz="1800" b="0" i="0" u="none" strike="noStrike" cap="none" spc="0" normalizeH="0" baseline="0">
             <a:ln>
               <a:noFill/>
             </a:ln>
@@ -1226,7 +1459,7 @@
           <a:buFontTx/>
           <a:buNone/>
           <a:tabLst/>
-          <a:defRPr b="0" baseline="0" cap="none" i="0" spc="0" strike="noStrike" sz="1800" u="none" kumimoji="0" normalizeH="0">
+          <a:defRPr kumimoji="0" sz="1800" b="0" i="0" u="none" strike="noStrike" cap="none" spc="0" normalizeH="0" baseline="0">
             <a:ln>
               <a:noFill/>
             </a:ln>
@@ -1252,7 +1485,7 @@
           <a:buFontTx/>
           <a:buNone/>
           <a:tabLst/>
-          <a:defRPr b="0" baseline="0" cap="none" i="0" spc="0" strike="noStrike" sz="1800" u="none" kumimoji="0" normalizeH="0">
+          <a:defRPr kumimoji="0" sz="1800" b="0" i="0" u="none" strike="noStrike" cap="none" spc="0" normalizeH="0" baseline="0">
             <a:ln>
               <a:noFill/>
             </a:ln>
@@ -1278,7 +1511,7 @@
           <a:buFontTx/>
           <a:buNone/>
           <a:tabLst/>
-          <a:defRPr b="0" baseline="0" cap="none" i="0" spc="0" strike="noStrike" sz="1800" u="none" kumimoji="0" normalizeH="0">
+          <a:defRPr kumimoji="0" sz="1800" b="0" i="0" u="none" strike="noStrike" cap="none" spc="0" normalizeH="0" baseline="0">
             <a:ln>
               <a:noFill/>
             </a:ln>
@@ -1304,7 +1537,7 @@
           <a:buFontTx/>
           <a:buNone/>
           <a:tabLst/>
-          <a:defRPr b="0" baseline="0" cap="none" i="0" spc="0" strike="noStrike" sz="1800" u="none" kumimoji="0" normalizeH="0">
+          <a:defRPr kumimoji="0" sz="1800" b="0" i="0" u="none" strike="noStrike" cap="none" spc="0" normalizeH="0" baseline="0">
             <a:ln>
               <a:noFill/>
             </a:ln>
@@ -1330,7 +1563,7 @@
           <a:buFontTx/>
           <a:buNone/>
           <a:tabLst/>
-          <a:defRPr b="0" baseline="0" cap="none" i="0" spc="0" strike="noStrike" sz="1800" u="none" kumimoji="0" normalizeH="0">
+          <a:defRPr kumimoji="0" sz="1800" b="0" i="0" u="none" strike="noStrike" cap="none" spc="0" normalizeH="0" baseline="0">
             <a:ln>
               <a:noFill/>
             </a:ln>
@@ -1356,7 +1589,7 @@
           <a:buFontTx/>
           <a:buNone/>
           <a:tabLst/>
-          <a:defRPr b="0" baseline="0" cap="none" i="0" spc="0" strike="noStrike" sz="1800" u="none" kumimoji="0" normalizeH="0">
+          <a:defRPr kumimoji="0" sz="1800" b="0" i="0" u="none" strike="noStrike" cap="none" spc="0" normalizeH="0" baseline="0">
             <a:ln>
               <a:noFill/>
             </a:ln>
@@ -1407,7 +1640,7 @@
           <a:buFontTx/>
           <a:buNone/>
           <a:tabLst/>
-          <a:defRPr b="0" baseline="0" cap="none" i="0" spc="0" strike="noStrike" sz="1800" u="none" kumimoji="0" normalizeH="0">
+          <a:defRPr kumimoji="0" sz="1800" b="0" i="0" u="none" strike="noStrike" cap="none" spc="0" normalizeH="0" baseline="0">
             <a:ln>
               <a:noFill/>
             </a:ln>
@@ -1433,7 +1666,7 @@
           <a:buFontTx/>
           <a:buNone/>
           <a:tabLst/>
-          <a:defRPr b="0" baseline="0" cap="none" i="0" spc="0" strike="noStrike" sz="1800" u="none" kumimoji="0" normalizeH="0">
+          <a:defRPr kumimoji="0" sz="1800" b="0" i="0" u="none" strike="noStrike" cap="none" spc="0" normalizeH="0" baseline="0">
             <a:ln>
               <a:noFill/>
             </a:ln>
@@ -1459,7 +1692,7 @@
           <a:buFontTx/>
           <a:buNone/>
           <a:tabLst/>
-          <a:defRPr b="0" baseline="0" cap="none" i="0" spc="0" strike="noStrike" sz="1800" u="none" kumimoji="0" normalizeH="0">
+          <a:defRPr kumimoji="0" sz="1800" b="0" i="0" u="none" strike="noStrike" cap="none" spc="0" normalizeH="0" baseline="0">
             <a:ln>
               <a:noFill/>
             </a:ln>
@@ -1485,7 +1718,7 @@
           <a:buFontTx/>
           <a:buNone/>
           <a:tabLst/>
-          <a:defRPr b="0" baseline="0" cap="none" i="0" spc="0" strike="noStrike" sz="1800" u="none" kumimoji="0" normalizeH="0">
+          <a:defRPr kumimoji="0" sz="1800" b="0" i="0" u="none" strike="noStrike" cap="none" spc="0" normalizeH="0" baseline="0">
             <a:ln>
               <a:noFill/>
             </a:ln>
@@ -1511,7 +1744,7 @@
           <a:buFontTx/>
           <a:buNone/>
           <a:tabLst/>
-          <a:defRPr b="0" baseline="0" cap="none" i="0" spc="0" strike="noStrike" sz="1800" u="none" kumimoji="0" normalizeH="0">
+          <a:defRPr kumimoji="0" sz="1800" b="0" i="0" u="none" strike="noStrike" cap="none" spc="0" normalizeH="0" baseline="0">
             <a:ln>
               <a:noFill/>
             </a:ln>
@@ -1537,7 +1770,7 @@
           <a:buFontTx/>
           <a:buNone/>
           <a:tabLst/>
-          <a:defRPr b="0" baseline="0" cap="none" i="0" spc="0" strike="noStrike" sz="1800" u="none" kumimoji="0" normalizeH="0">
+          <a:defRPr kumimoji="0" sz="1800" b="0" i="0" u="none" strike="noStrike" cap="none" spc="0" normalizeH="0" baseline="0">
             <a:ln>
               <a:noFill/>
             </a:ln>
@@ -1563,7 +1796,7 @@
           <a:buFontTx/>
           <a:buNone/>
           <a:tabLst/>
-          <a:defRPr b="0" baseline="0" cap="none" i="0" spc="0" strike="noStrike" sz="1800" u="none" kumimoji="0" normalizeH="0">
+          <a:defRPr kumimoji="0" sz="1800" b="0" i="0" u="none" strike="noStrike" cap="none" spc="0" normalizeH="0" baseline="0">
             <a:ln>
               <a:noFill/>
             </a:ln>
@@ -1589,7 +1822,7 @@
           <a:buFontTx/>
           <a:buNone/>
           <a:tabLst/>
-          <a:defRPr b="0" baseline="0" cap="none" i="0" spc="0" strike="noStrike" sz="1800" u="none" kumimoji="0" normalizeH="0">
+          <a:defRPr kumimoji="0" sz="1800" b="0" i="0" u="none" strike="noStrike" cap="none" spc="0" normalizeH="0" baseline="0">
             <a:ln>
               <a:noFill/>
             </a:ln>
@@ -1615,7 +1848,7 @@
           <a:buFontTx/>
           <a:buNone/>
           <a:tabLst/>
-          <a:defRPr b="0" baseline="0" cap="none" i="0" spc="0" strike="noStrike" sz="1800" u="none" kumimoji="0" normalizeH="0">
+          <a:defRPr kumimoji="0" sz="1800" b="0" i="0" u="none" strike="noStrike" cap="none" spc="0" normalizeH="0" baseline="0">
             <a:ln>
               <a:noFill/>
             </a:ln>
@@ -1641,7 +1874,7 @@
           <a:buFontTx/>
           <a:buNone/>
           <a:tabLst/>
-          <a:defRPr b="0" baseline="0" cap="none" i="0" spc="0" strike="noStrike" sz="1800" u="none" kumimoji="0" normalizeH="0">
+          <a:defRPr kumimoji="0" sz="1800" b="0" i="0" u="none" strike="noStrike" cap="none" spc="0" normalizeH="0" baseline="0">
             <a:ln>
               <a:noFill/>
             </a:ln>
@@ -1689,7 +1922,7 @@
           <a:buFontTx/>
           <a:buNone/>
           <a:tabLst/>
-          <a:defRPr b="0" baseline="0" cap="none" i="0" spc="0" strike="noStrike" sz="1100" u="none" kumimoji="0" normalizeH="0">
+          <a:defRPr kumimoji="0" sz="1100" b="0" i="0" u="none" strike="noStrike" cap="none" spc="0" normalizeH="0" baseline="0">
             <a:ln>
               <a:noFill/>
             </a:ln>
@@ -1719,7 +1952,7 @@
           <a:buFontTx/>
           <a:buNone/>
           <a:tabLst/>
-          <a:defRPr b="0" baseline="0" cap="none" i="0" spc="0" strike="noStrike" sz="1800" u="none" kumimoji="0" normalizeH="0">
+          <a:defRPr kumimoji="0" sz="1800" b="0" i="0" u="none" strike="noStrike" cap="none" spc="0" normalizeH="0" baseline="0">
             <a:ln>
               <a:noFill/>
             </a:ln>
@@ -1745,7 +1978,7 @@
           <a:buFontTx/>
           <a:buNone/>
           <a:tabLst/>
-          <a:defRPr b="0" baseline="0" cap="none" i="0" spc="0" strike="noStrike" sz="1800" u="none" kumimoji="0" normalizeH="0">
+          <a:defRPr kumimoji="0" sz="1800" b="0" i="0" u="none" strike="noStrike" cap="none" spc="0" normalizeH="0" baseline="0">
             <a:ln>
               <a:noFill/>
             </a:ln>
@@ -1771,7 +2004,7 @@
           <a:buFontTx/>
           <a:buNone/>
           <a:tabLst/>
-          <a:defRPr b="0" baseline="0" cap="none" i="0" spc="0" strike="noStrike" sz="1800" u="none" kumimoji="0" normalizeH="0">
+          <a:defRPr kumimoji="0" sz="1800" b="0" i="0" u="none" strike="noStrike" cap="none" spc="0" normalizeH="0" baseline="0">
             <a:ln>
               <a:noFill/>
             </a:ln>
@@ -1797,7 +2030,7 @@
           <a:buFontTx/>
           <a:buNone/>
           <a:tabLst/>
-          <a:defRPr b="0" baseline="0" cap="none" i="0" spc="0" strike="noStrike" sz="1800" u="none" kumimoji="0" normalizeH="0">
+          <a:defRPr kumimoji="0" sz="1800" b="0" i="0" u="none" strike="noStrike" cap="none" spc="0" normalizeH="0" baseline="0">
             <a:ln>
               <a:noFill/>
             </a:ln>
@@ -1823,7 +2056,7 @@
           <a:buFontTx/>
           <a:buNone/>
           <a:tabLst/>
-          <a:defRPr b="0" baseline="0" cap="none" i="0" spc="0" strike="noStrike" sz="1800" u="none" kumimoji="0" normalizeH="0">
+          <a:defRPr kumimoji="0" sz="1800" b="0" i="0" u="none" strike="noStrike" cap="none" spc="0" normalizeH="0" baseline="0">
             <a:ln>
               <a:noFill/>
             </a:ln>
@@ -1849,7 +2082,7 @@
           <a:buFontTx/>
           <a:buNone/>
           <a:tabLst/>
-          <a:defRPr b="0" baseline="0" cap="none" i="0" spc="0" strike="noStrike" sz="1800" u="none" kumimoji="0" normalizeH="0">
+          <a:defRPr kumimoji="0" sz="1800" b="0" i="0" u="none" strike="noStrike" cap="none" spc="0" normalizeH="0" baseline="0">
             <a:ln>
               <a:noFill/>
             </a:ln>
@@ -1875,7 +2108,7 @@
           <a:buFontTx/>
           <a:buNone/>
           <a:tabLst/>
-          <a:defRPr b="0" baseline="0" cap="none" i="0" spc="0" strike="noStrike" sz="1800" u="none" kumimoji="0" normalizeH="0">
+          <a:defRPr kumimoji="0" sz="1800" b="0" i="0" u="none" strike="noStrike" cap="none" spc="0" normalizeH="0" baseline="0">
             <a:ln>
               <a:noFill/>
             </a:ln>
@@ -1901,7 +2134,7 @@
           <a:buFontTx/>
           <a:buNone/>
           <a:tabLst/>
-          <a:defRPr b="0" baseline="0" cap="none" i="0" spc="0" strike="noStrike" sz="1800" u="none" kumimoji="0" normalizeH="0">
+          <a:defRPr kumimoji="0" sz="1800" b="0" i="0" u="none" strike="noStrike" cap="none" spc="0" normalizeH="0" baseline="0">
             <a:ln>
               <a:noFill/>
             </a:ln>
@@ -1927,7 +2160,7 @@
           <a:buFontTx/>
           <a:buNone/>
           <a:tabLst/>
-          <a:defRPr b="0" baseline="0" cap="none" i="0" spc="0" strike="noStrike" sz="1800" u="none" kumimoji="0" normalizeH="0">
+          <a:defRPr kumimoji="0" sz="1800" b="0" i="0" u="none" strike="noStrike" cap="none" spc="0" normalizeH="0" baseline="0">
             <a:ln>
               <a:noFill/>
             </a:ln>
@@ -1948,4 +2181,298 @@
     </a:txDef>
   </a:objectDefaults>
 </a:theme>
+</file>
+
+<file path=customXml/item1.xml><?xml version="1.0" encoding="utf-8"?>
+<ct:contentTypeSchema xmlns:ct="http://schemas.microsoft.com/office/2006/metadata/contentType" xmlns:ma="http://schemas.microsoft.com/office/2006/metadata/properties/metaAttributes" ct:_="" ma:_="" ma:contentTypeName="Document" ma:contentTypeID="0x0101004FCA482A6AF2494A961EEDA36B927C12" ma:contentTypeVersion="19" ma:contentTypeDescription="Create a new document." ma:contentTypeScope="" ma:versionID="fa925dddd58547fd69ca6716fde12271">
+  <xsd:schema xmlns:xsd="http://www.w3.org/2001/XMLSchema" xmlns:xs="http://www.w3.org/2001/XMLSchema" xmlns:p="http://schemas.microsoft.com/office/2006/metadata/properties" xmlns:ns2="3a9f5700-3bfc-4bef-946a-2b753025f277" xmlns:ns3="1623bc7a-e2ff-42f6-84aa-c68c5f1989c9" targetNamespace="http://schemas.microsoft.com/office/2006/metadata/properties" ma:root="true" ma:fieldsID="ecea943ad0ec6c11ff0c43a9457b2b59" ns2:_="" ns3:_="">
+    <xsd:import namespace="3a9f5700-3bfc-4bef-946a-2b753025f277"/>
+    <xsd:import namespace="1623bc7a-e2ff-42f6-84aa-c68c5f1989c9"/>
+    <xsd:element name="properties">
+      <xsd:complexType>
+        <xsd:sequence>
+          <xsd:element name="documentManagement">
+            <xsd:complexType>
+              <xsd:all>
+                <xsd:element ref="ns2:MediaServiceMetadata" minOccurs="0"/>
+                <xsd:element ref="ns2:MediaServiceFastMetadata" minOccurs="0"/>
+                <xsd:element ref="ns2:MediaServiceAutoKeyPoints" minOccurs="0"/>
+                <xsd:element ref="ns2:MediaServiceKeyPoints" minOccurs="0"/>
+                <xsd:element ref="ns3:SharedWithUsers" minOccurs="0"/>
+                <xsd:element ref="ns3:SharedWithDetails" minOccurs="0"/>
+                <xsd:element ref="ns2:MediaServiceDateTaken" minOccurs="0"/>
+                <xsd:element ref="ns2:MediaLengthInSeconds" minOccurs="0"/>
+                <xsd:element ref="ns2:lcf76f155ced4ddcb4097134ff3c332f" minOccurs="0"/>
+                <xsd:element ref="ns3:TaxCatchAll" minOccurs="0"/>
+                <xsd:element ref="ns2:MediaServiceOCR" minOccurs="0"/>
+                <xsd:element ref="ns2:MediaServiceGenerationTime" minOccurs="0"/>
+                <xsd:element ref="ns2:MediaServiceEventHashCode" minOccurs="0"/>
+                <xsd:element ref="ns2:MediaServiceLocation" minOccurs="0"/>
+                <xsd:element ref="ns2:_Flow_SignoffStatus" minOccurs="0"/>
+                <xsd:element ref="ns2:MediaServiceObjectDetectorVersions" minOccurs="0"/>
+                <xsd:element ref="ns2:MediaServiceSearchProperties" minOccurs="0"/>
+                <xsd:element ref="ns2:MediaServiceBillingMetadata" minOccurs="0"/>
+              </xsd:all>
+            </xsd:complexType>
+          </xsd:element>
+        </xsd:sequence>
+      </xsd:complexType>
+    </xsd:element>
+  </xsd:schema>
+  <xsd:schema xmlns:xsd="http://www.w3.org/2001/XMLSchema" xmlns:xs="http://www.w3.org/2001/XMLSchema" xmlns:dms="http://schemas.microsoft.com/office/2006/documentManagement/types" xmlns:pc="http://schemas.microsoft.com/office/infopath/2007/PartnerControls" targetNamespace="3a9f5700-3bfc-4bef-946a-2b753025f277" elementFormDefault="qualified">
+    <xsd:import namespace="http://schemas.microsoft.com/office/2006/documentManagement/types"/>
+    <xsd:import namespace="http://schemas.microsoft.com/office/infopath/2007/PartnerControls"/>
+    <xsd:element name="MediaServiceMetadata" ma:index="8" nillable="true" ma:displayName="MediaServiceMetadata" ma:hidden="true" ma:internalName="MediaServiceMetadata" ma:readOnly="true">
+      <xsd:simpleType>
+        <xsd:restriction base="dms:Note"/>
+      </xsd:simpleType>
+    </xsd:element>
+    <xsd:element name="MediaServiceFastMetadata" ma:index="9" nillable="true" ma:displayName="MediaServiceFastMetadata" ma:hidden="true" ma:internalName="MediaServiceFastMetadata" ma:readOnly="true">
+      <xsd:simpleType>
+        <xsd:restriction base="dms:Note"/>
+      </xsd:simpleType>
+    </xsd:element>
+    <xsd:element name="MediaServiceAutoKeyPoints" ma:index="10" nillable="true" ma:displayName="MediaServiceAutoKeyPoints" ma:hidden="true" ma:internalName="MediaServiceAutoKeyPoints" ma:readOnly="true">
+      <xsd:simpleType>
+        <xsd:restriction base="dms:Note"/>
+      </xsd:simpleType>
+    </xsd:element>
+    <xsd:element name="MediaServiceKeyPoints" ma:index="11" nillable="true" ma:displayName="KeyPoints" ma:internalName="MediaServiceKeyPoints" ma:readOnly="true">
+      <xsd:simpleType>
+        <xsd:restriction base="dms:Note">
+          <xsd:maxLength value="255"/>
+        </xsd:restriction>
+      </xsd:simpleType>
+    </xsd:element>
+    <xsd:element name="MediaServiceDateTaken" ma:index="14" nillable="true" ma:displayName="MediaServiceDateTaken" ma:hidden="true" ma:internalName="MediaServiceDateTaken" ma:readOnly="true">
+      <xsd:simpleType>
+        <xsd:restriction base="dms:Text"/>
+      </xsd:simpleType>
+    </xsd:element>
+    <xsd:element name="MediaLengthInSeconds" ma:index="15" nillable="true" ma:displayName="MediaLengthInSeconds" ma:hidden="true" ma:internalName="MediaLengthInSeconds" ma:readOnly="true">
+      <xsd:simpleType>
+        <xsd:restriction base="dms:Unknown"/>
+      </xsd:simpleType>
+    </xsd:element>
+    <xsd:element name="lcf76f155ced4ddcb4097134ff3c332f" ma:index="17" nillable="true" ma:taxonomy="true" ma:internalName="lcf76f155ced4ddcb4097134ff3c332f" ma:taxonomyFieldName="MediaServiceImageTags" ma:displayName="Image Tags" ma:readOnly="false" ma:fieldId="{5cf76f15-5ced-4ddc-b409-7134ff3c332f}" ma:taxonomyMulti="true" ma:sspId="41616629-9183-4d38-9e3a-f9db27d53a26" ma:termSetId="09814cd3-568e-fe90-9814-8d621ff8fb84" ma:anchorId="fba54fb3-c3e1-fe81-a776-ca4b69148c4d" ma:open="true" ma:isKeyword="false">
+      <xsd:complexType>
+        <xsd:sequence>
+          <xsd:element ref="pc:Terms" minOccurs="0" maxOccurs="1"/>
+        </xsd:sequence>
+      </xsd:complexType>
+    </xsd:element>
+    <xsd:element name="MediaServiceOCR" ma:index="19" nillable="true" ma:displayName="Extracted Text" ma:internalName="MediaServiceOCR" ma:readOnly="true">
+      <xsd:simpleType>
+        <xsd:restriction base="dms:Note">
+          <xsd:maxLength value="255"/>
+        </xsd:restriction>
+      </xsd:simpleType>
+    </xsd:element>
+    <xsd:element name="MediaServiceGenerationTime" ma:index="20" nillable="true" ma:displayName="MediaServiceGenerationTime" ma:hidden="true" ma:internalName="MediaServiceGenerationTime" ma:readOnly="true">
+      <xsd:simpleType>
+        <xsd:restriction base="dms:Text"/>
+      </xsd:simpleType>
+    </xsd:element>
+    <xsd:element name="MediaServiceEventHashCode" ma:index="21" nillable="true" ma:displayName="MediaServiceEventHashCode" ma:hidden="true" ma:internalName="MediaServiceEventHashCode" ma:readOnly="true">
+      <xsd:simpleType>
+        <xsd:restriction base="dms:Text"/>
+      </xsd:simpleType>
+    </xsd:element>
+    <xsd:element name="MediaServiceLocation" ma:index="22" nillable="true" ma:displayName="Location" ma:indexed="true" ma:internalName="MediaServiceLocation" ma:readOnly="true">
+      <xsd:simpleType>
+        <xsd:restriction base="dms:Text"/>
+      </xsd:simpleType>
+    </xsd:element>
+    <xsd:element name="_Flow_SignoffStatus" ma:index="23" nillable="true" ma:displayName="Sign-off status" ma:internalName="Sign_x002d_off_x0020_status">
+      <xsd:simpleType>
+        <xsd:restriction base="dms:Text"/>
+      </xsd:simpleType>
+    </xsd:element>
+    <xsd:element name="MediaServiceObjectDetectorVersions" ma:index="24" nillable="true" ma:displayName="MediaServiceObjectDetectorVersions" ma:hidden="true" ma:indexed="true" ma:internalName="MediaServiceObjectDetectorVersions" ma:readOnly="true">
+      <xsd:simpleType>
+        <xsd:restriction base="dms:Text"/>
+      </xsd:simpleType>
+    </xsd:element>
+    <xsd:element name="MediaServiceSearchProperties" ma:index="25" nillable="true" ma:displayName="MediaServiceSearchProperties" ma:hidden="true" ma:internalName="MediaServiceSearchProperties" ma:readOnly="true">
+      <xsd:simpleType>
+        <xsd:restriction base="dms:Note"/>
+      </xsd:simpleType>
+    </xsd:element>
+    <xsd:element name="MediaServiceBillingMetadata" ma:index="26" nillable="true" ma:displayName="MediaServiceBillingMetadata" ma:hidden="true" ma:internalName="MediaServiceBillingMetadata" ma:readOnly="true">
+      <xsd:simpleType>
+        <xsd:restriction base="dms:Note"/>
+      </xsd:simpleType>
+    </xsd:element>
+  </xsd:schema>
+  <xsd:schema xmlns:xsd="http://www.w3.org/2001/XMLSchema" xmlns:xs="http://www.w3.org/2001/XMLSchema" xmlns:dms="http://schemas.microsoft.com/office/2006/documentManagement/types" xmlns:pc="http://schemas.microsoft.com/office/infopath/2007/PartnerControls" targetNamespace="1623bc7a-e2ff-42f6-84aa-c68c5f1989c9" elementFormDefault="qualified">
+    <xsd:import namespace="http://schemas.microsoft.com/office/2006/documentManagement/types"/>
+    <xsd:import namespace="http://schemas.microsoft.com/office/infopath/2007/PartnerControls"/>
+    <xsd:element name="SharedWithUsers" ma:index="12" nillable="true" ma:displayName="Shared With" ma:internalName="SharedWithUsers" ma:readOnly="true">
+      <xsd:complexType>
+        <xsd:complexContent>
+          <xsd:extension base="dms:UserMulti">
+            <xsd:sequence>
+              <xsd:element name="UserInfo" minOccurs="0" maxOccurs="unbounded">
+                <xsd:complexType>
+                  <xsd:sequence>
+                    <xsd:element name="DisplayName" type="xsd:string" minOccurs="0"/>
+                    <xsd:element name="AccountId" type="dms:UserId" minOccurs="0" nillable="true"/>
+                    <xsd:element name="AccountType" type="xsd:string" minOccurs="0"/>
+                  </xsd:sequence>
+                </xsd:complexType>
+              </xsd:element>
+            </xsd:sequence>
+          </xsd:extension>
+        </xsd:complexContent>
+      </xsd:complexType>
+    </xsd:element>
+    <xsd:element name="SharedWithDetails" ma:index="13" nillable="true" ma:displayName="Shared With Details" ma:internalName="SharedWithDetails" ma:readOnly="true">
+      <xsd:simpleType>
+        <xsd:restriction base="dms:Note">
+          <xsd:maxLength value="255"/>
+        </xsd:restriction>
+      </xsd:simpleType>
+    </xsd:element>
+    <xsd:element name="TaxCatchAll" ma:index="18" nillable="true" ma:displayName="Taxonomy Catch All Column" ma:hidden="true" ma:list="{7d0e8dad-8b2c-4748-9e22-6166cf2b1621}" ma:internalName="TaxCatchAll" ma:showField="CatchAllData" ma:web="1623bc7a-e2ff-42f6-84aa-c68c5f1989c9">
+      <xsd:complexType>
+        <xsd:complexContent>
+          <xsd:extension base="dms:MultiChoiceLookup">
+            <xsd:sequence>
+              <xsd:element name="Value" type="dms:Lookup" maxOccurs="unbounded" minOccurs="0" nillable="true"/>
+            </xsd:sequence>
+          </xsd:extension>
+        </xsd:complexContent>
+      </xsd:complexType>
+    </xsd:element>
+  </xsd:schema>
+  <xsd:schema xmlns="http://schemas.openxmlformats.org/package/2006/metadata/core-properties" xmlns:xsd="http://www.w3.org/2001/XMLSchema" xmlns:xsi="http://www.w3.org/2001/XMLSchema-instance" xmlns:dc="http://purl.org/dc/elements/1.1/" xmlns:dcterms="http://purl.org/dc/terms/" xmlns:odoc="http://schemas.microsoft.com/internal/obd" targetNamespace="http://schemas.openxmlformats.org/package/2006/metadata/core-properties" elementFormDefault="qualified" attributeFormDefault="unqualified" blockDefault="#all">
+    <xsd:import namespace="http://purl.org/dc/elements/1.1/" schemaLocation="http://dublincore.org/schemas/xmls/qdc/2003/04/02/dc.xsd"/>
+    <xsd:import namespace="http://purl.org/dc/terms/" schemaLocation="http://dublincore.org/schemas/xmls/qdc/2003/04/02/dcterms.xsd"/>
+    <xsd:element name="coreProperties" type="CT_coreProperties"/>
+    <xsd:complexType name="CT_coreProperties">
+      <xsd:all>
+        <xsd:element ref="dc:creator" minOccurs="0" maxOccurs="1"/>
+        <xsd:element ref="dcterms:created" minOccurs="0" maxOccurs="1"/>
+        <xsd:element ref="dc:identifier" minOccurs="0" maxOccurs="1"/>
+        <xsd:element name="contentType" minOccurs="0" maxOccurs="1" type="xsd:string" ma:index="0" ma:displayName="Content Type"/>
+        <xsd:element ref="dc:title" minOccurs="0" maxOccurs="1" ma:index="4" ma:displayName="Title"/>
+        <xsd:element ref="dc:subject" minOccurs="0" maxOccurs="1"/>
+        <xsd:element ref="dc:description" minOccurs="0" maxOccurs="1"/>
+        <xsd:element name="keywords" minOccurs="0" maxOccurs="1" type="xsd:string"/>
+        <xsd:element ref="dc:language" minOccurs="0" maxOccurs="1"/>
+        <xsd:element name="category" minOccurs="0" maxOccurs="1" type="xsd:string"/>
+        <xsd:element name="version" minOccurs="0" maxOccurs="1" type="xsd:string"/>
+        <xsd:element name="revision" minOccurs="0" maxOccurs="1" type="xsd:string">
+          <xsd:annotation>
+            <xsd:documentation>
+                        This value indicates the number of saves or revisions. The application is responsible for updating this value after each revision.
+                    </xsd:documentation>
+          </xsd:annotation>
+        </xsd:element>
+        <xsd:element name="lastModifiedBy" minOccurs="0" maxOccurs="1" type="xsd:string"/>
+        <xsd:element ref="dcterms:modified" minOccurs="0" maxOccurs="1"/>
+        <xsd:element name="contentStatus" minOccurs="0" maxOccurs="1" type="xsd:string"/>
+      </xsd:all>
+    </xsd:complexType>
+  </xsd:schema>
+  <xs:schema xmlns:pc="http://schemas.microsoft.com/office/infopath/2007/PartnerControls" xmlns:xs="http://www.w3.org/2001/XMLSchema" targetNamespace="http://schemas.microsoft.com/office/infopath/2007/PartnerControls" elementFormDefault="qualified" attributeFormDefault="unqualified">
+    <xs:element name="Person">
+      <xs:complexType>
+        <xs:sequence>
+          <xs:element ref="pc:DisplayName" minOccurs="0"/>
+          <xs:element ref="pc:AccountId" minOccurs="0"/>
+          <xs:element ref="pc:AccountType" minOccurs="0"/>
+        </xs:sequence>
+      </xs:complexType>
+    </xs:element>
+    <xs:element name="DisplayName" type="xs:string"/>
+    <xs:element name="AccountId" type="xs:string"/>
+    <xs:element name="AccountType" type="xs:string"/>
+    <xs:element name="BDCAssociatedEntity">
+      <xs:complexType>
+        <xs:sequence>
+          <xs:element ref="pc:BDCEntity" minOccurs="0" maxOccurs="unbounded"/>
+        </xs:sequence>
+        <xs:attribute ref="pc:EntityNamespace"/>
+        <xs:attribute ref="pc:EntityName"/>
+        <xs:attribute ref="pc:SystemInstanceName"/>
+        <xs:attribute ref="pc:AssociationName"/>
+      </xs:complexType>
+    </xs:element>
+    <xs:attribute name="EntityNamespace" type="xs:string"/>
+    <xs:attribute name="EntityName" type="xs:string"/>
+    <xs:attribute name="SystemInstanceName" type="xs:string"/>
+    <xs:attribute name="AssociationName" type="xs:string"/>
+    <xs:element name="BDCEntity">
+      <xs:complexType>
+        <xs:sequence>
+          <xs:element ref="pc:EntityDisplayName" minOccurs="0"/>
+          <xs:element ref="pc:EntityInstanceReference" minOccurs="0"/>
+          <xs:element ref="pc:EntityId1" minOccurs="0"/>
+          <xs:element ref="pc:EntityId2" minOccurs="0"/>
+          <xs:element ref="pc:EntityId3" minOccurs="0"/>
+          <xs:element ref="pc:EntityId4" minOccurs="0"/>
+          <xs:element ref="pc:EntityId5" minOccurs="0"/>
+        </xs:sequence>
+      </xs:complexType>
+    </xs:element>
+    <xs:element name="EntityDisplayName" type="xs:string"/>
+    <xs:element name="EntityInstanceReference" type="xs:string"/>
+    <xs:element name="EntityId1" type="xs:string"/>
+    <xs:element name="EntityId2" type="xs:string"/>
+    <xs:element name="EntityId3" type="xs:string"/>
+    <xs:element name="EntityId4" type="xs:string"/>
+    <xs:element name="EntityId5" type="xs:string"/>
+    <xs:element name="Terms">
+      <xs:complexType>
+        <xs:sequence>
+          <xs:element ref="pc:TermInfo" minOccurs="0" maxOccurs="unbounded"/>
+        </xs:sequence>
+      </xs:complexType>
+    </xs:element>
+    <xs:element name="TermInfo">
+      <xs:complexType>
+        <xs:sequence>
+          <xs:element ref="pc:TermName" minOccurs="0"/>
+          <xs:element ref="pc:TermId" minOccurs="0"/>
+        </xs:sequence>
+      </xs:complexType>
+    </xs:element>
+    <xs:element name="TermName" type="xs:string"/>
+    <xs:element name="TermId" type="xs:string"/>
+  </xs:schema>
+</ct:contentTypeSchema>
+</file>
+
+<file path=customXml/item2.xml><?xml version="1.0" encoding="utf-8"?>
+<?mso-contentType ?>
+<FormTemplates xmlns="http://schemas.microsoft.com/sharepoint/v3/contenttype/forms">
+  <Display>DocumentLibraryForm</Display>
+  <Edit>DocumentLibraryForm</Edit>
+  <New>DocumentLibraryForm</New>
+</FormTemplates>
+</file>
+
+<file path=customXml/item3.xml><?xml version="1.0" encoding="utf-8"?>
+<p:properties xmlns:p="http://schemas.microsoft.com/office/2006/metadata/properties" xmlns:xsi="http://www.w3.org/2001/XMLSchema-instance" xmlns:pc="http://schemas.microsoft.com/office/infopath/2007/PartnerControls">
+  <documentManagement>
+    <TaxCatchAll xmlns="1623bc7a-e2ff-42f6-84aa-c68c5f1989c9" xsi:nil="true"/>
+    <_Flow_SignoffStatus xmlns="3a9f5700-3bfc-4bef-946a-2b753025f277" xsi:nil="true"/>
+    <lcf76f155ced4ddcb4097134ff3c332f xmlns="3a9f5700-3bfc-4bef-946a-2b753025f277">
+      <Terms xmlns="http://schemas.microsoft.com/office/infopath/2007/PartnerControls"/>
+    </lcf76f155ced4ddcb4097134ff3c332f>
+  </documentManagement>
+</p:properties>
+</file>
+
+<file path=customXml/itemProps1.xml><?xml version="1.0" encoding="utf-8"?>
+<ds:datastoreItem xmlns:ds="http://schemas.openxmlformats.org/officeDocument/2006/customXml" ds:itemID="{F7B95014-C8D7-464D-871D-66067035EE36}"/>
+</file>
+
+<file path=customXml/itemProps2.xml><?xml version="1.0" encoding="utf-8"?>
+<ds:datastoreItem xmlns:ds="http://schemas.openxmlformats.org/officeDocument/2006/customXml" ds:itemID="{5CC4DF8F-291E-4605-BF4C-8AC71BA6D778}"/>
+</file>
+
+<file path=customXml/itemProps3.xml><?xml version="1.0" encoding="utf-8"?>
+<ds:datastoreItem xmlns:ds="http://schemas.openxmlformats.org/officeDocument/2006/customXml" ds:itemID="{A96E4DC5-469F-416A-808D-32014371B03B}"/>
 </file>
</xml_diff>